<commit_message>
Fix D4-3 README document encoding
</commit_message>
<xml_diff>
--- a/quality/D4-3_自动化测试代码与运行报告/README.docx
+++ b/quality/D4-3_自动化测试代码与运行报告/README.docx
@@ -348,13 +348,11 @@
         <w:jc w:val="left"/>
       </w:pPr>
       <w:r>
-        <w:rPr>
-          <w:rFonts w:ascii="Microsoft YaHei" w:hAnsi="Microsoft YaHei" w:eastAsia="Microsoft YaHei"/>
-          <w:b w:val="0"/>
-          <w:color w:val="2B2B2B"/>
-          <w:sz w:val="21"/>
-        </w:rPr>
-        <w:t>本目录提供自动化测试的目录骨架。每个子目录都对应测试金字塔的一层。</w:t>
+        <w:t>本目录是实验四 D4-3 交付物，基于仓库中已有的两个 FastAPI 服务编写：</w:t>
+        <w:br/>
+        <w:t>`reservation-service`：预约创建、查询、签到、取消。</w:t>
+        <w:br/>
+        <w:t>`member-service`：会员查询、权益查询、优惠券核销、营销授权。</w:t>
       </w:r>
     </w:p>
     <w:p>
@@ -397,129 +395,29 @@
             </w:tcBorders>
           </w:tcPr>
           <w:p>
-            <w:pPr>
-              <w:spacing w:after="0" w:line="288" w:lineRule="auto"/>
-            </w:pPr>
+            <w:pPr/>
+            <w:r/>
             <w:r>
               <w:rPr>
-                <w:rFonts w:ascii="Consolas" w:hAnsi="Consolas" w:eastAsia="Consolas"/>
-                <w:b w:val="0"/>
-                <w:color w:val="F0F0F0"/>
-                <w:sz w:val="19"/>
+                <w:rFonts w:ascii="Consolas" w:hAnsi="Consolas"/>
               </w:rPr>
-              <w:t>tests/</w:t>
-            </w:r>
-          </w:p>
-          <w:p>
-            <w:pPr>
-              <w:spacing w:after="0" w:line="288" w:lineRule="auto"/>
-            </w:pPr>
-            <w:r>
-              <w:rPr>
-                <w:rFonts w:ascii="Consolas" w:hAnsi="Consolas" w:eastAsia="Consolas"/>
-                <w:b w:val="0"/>
-                <w:color w:val="F0F0F0"/>
-                <w:sz w:val="19"/>
-              </w:rPr>
-              <w:t>├── unit/         ≥ 70% 行覆盖</w:t>
-            </w:r>
-          </w:p>
-          <w:p>
-            <w:pPr>
-              <w:spacing w:after="0" w:line="288" w:lineRule="auto"/>
-            </w:pPr>
-            <w:r>
-              <w:rPr>
-                <w:rFonts w:ascii="Consolas" w:hAnsi="Consolas" w:eastAsia="Consolas"/>
-                <w:b w:val="0"/>
-                <w:color w:val="F0F0F0"/>
-                <w:sz w:val="19"/>
-              </w:rPr>
-              <w:t>├── property/     PBT，≥ 5 个</w:t>
-            </w:r>
-          </w:p>
-          <w:p>
-            <w:pPr>
-              <w:spacing w:after="0" w:line="288" w:lineRule="auto"/>
-            </w:pPr>
-            <w:r>
-              <w:rPr>
-                <w:rFonts w:ascii="Consolas" w:hAnsi="Consolas" w:eastAsia="Consolas"/>
-                <w:b w:val="0"/>
-                <w:color w:val="F0F0F0"/>
-                <w:sz w:val="19"/>
-              </w:rPr>
-              <w:t>├── contract/     Pact，≥ 3 对</w:t>
-            </w:r>
-          </w:p>
-          <w:p>
-            <w:pPr>
-              <w:spacing w:after="0" w:line="288" w:lineRule="auto"/>
-            </w:pPr>
-            <w:r>
-              <w:rPr>
-                <w:rFonts w:ascii="Consolas" w:hAnsi="Consolas" w:eastAsia="Consolas"/>
-                <w:b w:val="0"/>
-                <w:color w:val="F0F0F0"/>
-                <w:sz w:val="19"/>
-              </w:rPr>
-              <w:t>├── integration/  Testcontainers，≥ 10 个</w:t>
-            </w:r>
-          </w:p>
-          <w:p>
-            <w:pPr>
-              <w:spacing w:after="0" w:line="288" w:lineRule="auto"/>
-            </w:pPr>
-            <w:r>
-              <w:rPr>
-                <w:rFonts w:ascii="Consolas" w:hAnsi="Consolas" w:eastAsia="Consolas"/>
-                <w:b w:val="0"/>
-                <w:color w:val="F0F0F0"/>
-                <w:sz w:val="19"/>
-              </w:rPr>
-              <w:t>├── e2e/          3 条用户旅程</w:t>
-            </w:r>
-          </w:p>
-          <w:p>
-            <w:pPr>
-              <w:spacing w:after="0" w:line="288" w:lineRule="auto"/>
-            </w:pPr>
-            <w:r>
-              <w:rPr>
-                <w:rFonts w:ascii="Consolas" w:hAnsi="Consolas" w:eastAsia="Consolas"/>
-                <w:b w:val="0"/>
-                <w:color w:val="F0F0F0"/>
-                <w:sz w:val="19"/>
-              </w:rPr>
-              <w:t>├── perf/         k6 / JMeter 脚本</w:t>
-            </w:r>
-          </w:p>
-          <w:p>
-            <w:pPr>
-              <w:spacing w:after="0" w:line="288" w:lineRule="auto"/>
-            </w:pPr>
-            <w:r>
-              <w:rPr>
-                <w:rFonts w:ascii="Consolas" w:hAnsi="Consolas" w:eastAsia="Consolas"/>
-                <w:b w:val="0"/>
-                <w:color w:val="F0F0F0"/>
-                <w:sz w:val="19"/>
-              </w:rPr>
-              <w:t>├── security/     ZAP 配置</w:t>
-            </w:r>
-          </w:p>
-          <w:p>
-            <w:pPr>
-              <w:spacing w:after="0" w:line="288" w:lineRule="auto"/>
-            </w:pPr>
-            <w:r>
-              <w:rPr>
-                <w:rFonts w:ascii="Consolas" w:hAnsi="Consolas" w:eastAsia="Consolas"/>
-                <w:b w:val="0"/>
-                <w:color w:val="F0F0F0"/>
-                <w:sz w:val="19"/>
-              </w:rPr>
-              <w:t>└── reports/      coverage.html / mutation.html / pact.html / junit.xml</w:t>
+              <w:t>D4-3_自动化测试代码与运行报告/</w:t>
+              <w:br/>
+              <w:t>unit/         单元/API 测试，验证单个服务的接口、状态码和业务规则</w:t>
+              <w:br/>
+              <w:t>property/     Hypothesis 属性测试，自动生成边界输入</w:t>
+              <w:br/>
+              <w:t>contract/     契约测试，验证消费者期望的字段和状态码</w:t>
+              <w:br/>
+              <w:t>integration/  集成/冒烟测试，验证两个服务都能被加载并完成核心链路</w:t>
+              <w:br/>
+              <w:t>e2e/          Playwright 用户旅程脚本，占位说明完整前端未实现</w:t>
+              <w:br/>
+              <w:t>perf/         k6 性能压测脚本</w:t>
+              <w:br/>
+              <w:t>security/     OWASP ZAP baseline 配置</w:t>
+              <w:br/>
+              <w:t>reports/      pytest、覆盖率、性能、安全等运行报告输出目录</w:t>
             </w:r>
           </w:p>
         </w:tc>
@@ -566,101 +464,44 @@
             </w:tcBorders>
           </w:tcPr>
           <w:p>
-            <w:pPr>
-              <w:spacing w:after="0" w:line="288" w:lineRule="auto"/>
-            </w:pPr>
+            <w:pPr/>
+            <w:r/>
             <w:r>
               <w:rPr>
-                <w:rFonts w:ascii="Consolas" w:hAnsi="Consolas" w:eastAsia="Consolas"/>
-                <w:b w:val="0"/>
-                <w:color w:val="F0F0F0"/>
-                <w:sz w:val="19"/>
+                <w:rFonts w:ascii="Consolas" w:hAnsi="Consolas"/>
               </w:rPr>
-              <w:t>pytest tests/unit --cov</w:t>
-            </w:r>
-          </w:p>
-          <w:p>
-            <w:pPr>
-              <w:spacing w:after="0" w:line="288" w:lineRule="auto"/>
-            </w:pPr>
-            <w:r>
-              <w:rPr>
-                <w:rFonts w:ascii="Consolas" w:hAnsi="Consolas" w:eastAsia="Consolas"/>
-                <w:b w:val="0"/>
-                <w:color w:val="F0F0F0"/>
-                <w:sz w:val="19"/>
-              </w:rPr>
-              <w:t>pytest tests/property</w:t>
-            </w:r>
-          </w:p>
-          <w:p>
-            <w:pPr>
-              <w:spacing w:after="0" w:line="288" w:lineRule="auto"/>
-            </w:pPr>
-            <w:r>
-              <w:rPr>
-                <w:rFonts w:ascii="Consolas" w:hAnsi="Consolas" w:eastAsia="Consolas"/>
-                <w:b w:val="0"/>
-                <w:color w:val="F0F0F0"/>
-                <w:sz w:val="19"/>
-              </w:rPr>
-              <w:t>pact-broker publish ...</w:t>
-            </w:r>
-          </w:p>
-          <w:p>
-            <w:pPr>
-              <w:spacing w:after="0" w:line="288" w:lineRule="auto"/>
-            </w:pPr>
-            <w:r>
-              <w:rPr>
-                <w:rFonts w:ascii="Consolas" w:hAnsi="Consolas" w:eastAsia="Consolas"/>
-                <w:b w:val="0"/>
-                <w:color w:val="F0F0F0"/>
-                <w:sz w:val="19"/>
-              </w:rPr>
-              <w:t>pytest tests/integration</w:t>
-            </w:r>
-          </w:p>
-          <w:p>
-            <w:pPr>
-              <w:spacing w:after="0" w:line="288" w:lineRule="auto"/>
-            </w:pPr>
-            <w:r>
-              <w:rPr>
-                <w:rFonts w:ascii="Consolas" w:hAnsi="Consolas" w:eastAsia="Consolas"/>
-                <w:b w:val="0"/>
-                <w:color w:val="F0F0F0"/>
-                <w:sz w:val="19"/>
-              </w:rPr>
-              <w:t>playwright test tests/e2e</w:t>
-            </w:r>
-          </w:p>
-          <w:p>
-            <w:pPr>
-              <w:spacing w:after="0" w:line="288" w:lineRule="auto"/>
-            </w:pPr>
-            <w:r>
-              <w:rPr>
-                <w:rFonts w:ascii="Consolas" w:hAnsi="Consolas" w:eastAsia="Consolas"/>
-                <w:b w:val="0"/>
-                <w:color w:val="F0F0F0"/>
-                <w:sz w:val="19"/>
-              </w:rPr>
-              <w:t>k6 run tests/perf/reservation.js</w:t>
-            </w:r>
-          </w:p>
-          <w:p>
-            <w:pPr>
-              <w:spacing w:after="0" w:line="288" w:lineRule="auto"/>
-            </w:pPr>
-            <w:r>
-              <w:rPr>
-                <w:rFonts w:ascii="Consolas" w:hAnsi="Consolas" w:eastAsia="Consolas"/>
-                <w:b w:val="0"/>
-                <w:color w:val="F0F0F0"/>
-                <w:sz w:val="19"/>
-              </w:rPr>
-              <w:t>zap-baseline.py -t http://gateway</w:t>
+              <w:t>cd "quality\D4-3_自动化测试代码与运行报告"</w:t>
+              <w:br/>
+              <w:t>python -m pip install -r requirements-test.txt</w:t>
+              <w:br/>
+              <w:br/>
+              <w:t>$env:D3_REPO="C:\Users\LENOVO\Desktop\软件工程\软件工程实验任务书_2026春\实验三_DevOps流水线与容器化部署\实验三_产出\D3-2_源代码与配置仓库"</w:t>
+              <w:br/>
+              <w:br/>
+              <w:t>pytest</w:t>
+              <w:br/>
+              <w:br/>
+              <w:t>pytest --cov="..\..\services" --cov-report=html:reports/coverage-html --cov-report=term-missing</w:t>
+              <w:br/>
+              <w:br/>
+              <w:t>pytest unit</w:t>
+              <w:br/>
+              <w:t>pytest property</w:t>
+              <w:br/>
+              <w:t>pytest integration</w:t>
+              <w:br/>
+              <w:t>pytest contract</w:t>
+              <w:br/>
+              <w:br/>
+              <w:t>cd "C:\Users\LENOVO\Desktop\软件工程\软件工程实验任务书_2026春\实验三_DevOps流水线与容器化部署\实验三_产出\D3-2_源代码与配置仓库"</w:t>
+              <w:br/>
+              <w:t>docker compose up -d --build</w:t>
+              <w:br/>
+              <w:br/>
+              <w:t>k6 run "quality\D4-3_自动化测试代码与运行报告\perf\reservation.js"</w:t>
+              <w:br/>
+              <w:br/>
+              <w:t>zap-baseline.py -t http://localhost:8081 -c security/zap-baseline.conf -r reports/zap-reservation.html</w:t>
             </w:r>
           </w:p>
         </w:tc>

</xml_diff>